<commit_message>
Made better labs for UserService chapter 2 and 4
</commit_message>
<xml_diff>
--- a/Labs/EG 01-Testing and SDLC - C#.docx
+++ b/Labs/EG 01-Testing and SDLC - C#.docx
@@ -330,11 +330,9 @@
             <w:tcW w:w="1379" w:type="dxa"/>
           </w:tcPr>
           <w:p>
-            <w:proofErr w:type="spellStart"/>
             <w:r>
               <w:t>UserService</w:t>
             </w:r>
-            <w:proofErr w:type="spellEnd"/>
           </w:p>
         </w:tc>
         <w:tc>
@@ -342,11 +340,9 @@
             <w:tcW w:w="1426" w:type="dxa"/>
           </w:tcPr>
           <w:p>
-            <w:proofErr w:type="spellStart"/>
             <w:r>
               <w:t>registerUser</w:t>
             </w:r>
-            <w:proofErr w:type="spellEnd"/>
           </w:p>
         </w:tc>
         <w:tc>
@@ -386,11 +382,9 @@
             <w:tcW w:w="1379" w:type="dxa"/>
           </w:tcPr>
           <w:p>
-            <w:proofErr w:type="spellStart"/>
             <w:r>
               <w:t>UserService</w:t>
             </w:r>
-            <w:proofErr w:type="spellEnd"/>
           </w:p>
         </w:tc>
         <w:tc>
@@ -398,11 +392,9 @@
             <w:tcW w:w="1426" w:type="dxa"/>
           </w:tcPr>
           <w:p>
-            <w:proofErr w:type="spellStart"/>
             <w:r>
               <w:t>registerUser</w:t>
             </w:r>
-            <w:proofErr w:type="spellEnd"/>
           </w:p>
         </w:tc>
         <w:tc>
@@ -421,15 +413,7 @@
           </w:tcPr>
           <w:p>
             <w:r>
-              <w:t xml:space="preserve">Throws </w:t>
-            </w:r>
-            <w:proofErr w:type="spellStart"/>
-            <w:r>
-              <w:t>IllegalArgumentException</w:t>
-            </w:r>
-            <w:proofErr w:type="spellEnd"/>
-            <w:r>
-              <w:t xml:space="preserve"> with "Username already exists"</w:t>
+              <w:t>Throws ArgumentException with "Username already exists"</w:t>
             </w:r>
           </w:p>
         </w:tc>
@@ -589,13 +573,8 @@
         <w:t>C#</w:t>
       </w:r>
       <w:r>
-        <w:t xml:space="preserve"> </w:t>
-      </w:r>
-      <w:proofErr w:type="spellStart"/>
-      <w:r>
-        <w:t>UserService</w:t>
-      </w:r>
-      <w:proofErr w:type="spellEnd"/>
+        <w:t xml:space="preserve"> UserService</w:t>
+      </w:r>
     </w:p>
     <w:p>
       <w:pPr>
@@ -718,7 +697,6 @@
         </w:rPr>
         <w:t xml:space="preserve"> </w:t>
       </w:r>
-      <w:proofErr w:type="spellStart"/>
       <w:r>
         <w:rPr>
           <w:rFonts w:ascii="Consolas" w:hAnsi="Consolas" w:cs="Consolas"/>
@@ -731,7 +709,6 @@
         </w:rPr>
         <w:t>UserService</w:t>
       </w:r>
-      <w:proofErr w:type="spellEnd"/>
     </w:p>
     <w:p>
       <w:pPr>
@@ -954,7 +931,6 @@
         </w:rPr>
         <w:t xml:space="preserve"> </w:t>
       </w:r>
-      <w:proofErr w:type="spellStart"/>
       <w:r>
         <w:rPr>
           <w:rFonts w:ascii="Consolas" w:hAnsi="Consolas" w:cs="Consolas"/>
@@ -977,20 +953,7 @@
           <w:szCs w:val="19"/>
           <w:lang w:eastAsia="en-US"/>
         </w:rPr>
-        <w:t>egisterUser</w:t>
-      </w:r>
-      <w:proofErr w:type="spellEnd"/>
-      <w:r>
-        <w:rPr>
-          <w:rFonts w:ascii="Consolas" w:hAnsi="Consolas" w:cs="Consolas"/>
-          <w:b/>
-          <w:bCs/>
-          <w:color w:val="000000"/>
-          <w:sz w:val="19"/>
-          <w:szCs w:val="19"/>
-          <w:lang w:eastAsia="en-US"/>
-        </w:rPr>
-        <w:t>(String username, String password, String role)</w:t>
+        <w:t>egisterUser(String username, String password, String role)</w:t>
       </w:r>
     </w:p>
     <w:p>
@@ -1052,7 +1015,6 @@
         </w:rPr>
         <w:t xml:space="preserve"> throw </w:t>
       </w:r>
-      <w:proofErr w:type="spellStart"/>
       <w:r>
         <w:rPr>
           <w:rFonts w:ascii="Consolas" w:hAnsi="Consolas" w:cs="Consolas"/>
@@ -1061,18 +1023,7 @@
           <w:szCs w:val="19"/>
           <w:lang w:eastAsia="en-US"/>
         </w:rPr>
-        <w:t>IllegalArgumentException</w:t>
-      </w:r>
-      <w:proofErr w:type="spellEnd"/>
-      <w:r>
-        <w:rPr>
-          <w:rFonts w:ascii="Consolas" w:hAnsi="Consolas" w:cs="Consolas"/>
-          <w:color w:val="77206D" w:themeColor="accent5" w:themeShade="BF"/>
-          <w:sz w:val="19"/>
-          <w:szCs w:val="19"/>
-          <w:lang w:eastAsia="en-US"/>
-        </w:rPr>
-        <w:t xml:space="preserve"> </w:t>
+        <w:t xml:space="preserve">IllegalArgumentException </w:t>
       </w:r>
       <w:r>
         <w:rPr>
@@ -1474,7 +1425,6 @@
         </w:rPr>
         <w:tab/>
       </w:r>
-      <w:proofErr w:type="spellStart"/>
       <w:r>
         <w:rPr>
           <w:rFonts w:ascii="Consolas" w:hAnsi="Consolas" w:cs="Consolas"/>
@@ -1499,7 +1449,6 @@
         </w:rPr>
         <w:t>Add</w:t>
       </w:r>
-      <w:proofErr w:type="spellEnd"/>
       <w:r>
         <w:rPr>
           <w:rFonts w:ascii="Consolas" w:hAnsi="Consolas" w:cs="Consolas"/>
@@ -1699,7 +1648,6 @@
         </w:rPr>
         <w:t xml:space="preserve"> bool </w:t>
       </w:r>
-      <w:proofErr w:type="spellStart"/>
       <w:r>
         <w:rPr>
           <w:rFonts w:ascii="Consolas" w:hAnsi="Consolas" w:cs="Consolas"/>
@@ -1722,20 +1670,7 @@
           <w:szCs w:val="19"/>
           <w:lang w:eastAsia="en-US"/>
         </w:rPr>
-        <w:t>oginUser</w:t>
-      </w:r>
-      <w:proofErr w:type="spellEnd"/>
-      <w:r>
-        <w:rPr>
-          <w:rFonts w:ascii="Consolas" w:hAnsi="Consolas" w:cs="Consolas"/>
-          <w:b/>
-          <w:bCs/>
-          <w:color w:val="000000"/>
-          <w:sz w:val="19"/>
-          <w:szCs w:val="19"/>
-          <w:lang w:eastAsia="en-US"/>
-        </w:rPr>
-        <w:t>(</w:t>
+        <w:t>oginUser(</w:t>
       </w:r>
       <w:r>
         <w:rPr>
@@ -1848,7 +1783,6 @@
         </w:rPr>
         <w:t xml:space="preserve"> throw </w:t>
       </w:r>
-      <w:proofErr w:type="spellStart"/>
       <w:r>
         <w:rPr>
           <w:rFonts w:ascii="Consolas" w:hAnsi="Consolas" w:cs="Consolas"/>
@@ -1857,9 +1791,34 @@
           <w:szCs w:val="19"/>
           <w:lang w:eastAsia="en-US"/>
         </w:rPr>
-        <w:t>ArgumentException</w:t>
-      </w:r>
-      <w:proofErr w:type="spellEnd"/>
+        <w:t xml:space="preserve">ArgumentException </w:t>
+      </w:r>
+      <w:r>
+        <w:rPr>
+          <w:rFonts w:ascii="Consolas" w:hAnsi="Consolas" w:cs="Consolas"/>
+          <w:color w:val="3A7C22" w:themeColor="accent6" w:themeShade="BF"/>
+          <w:sz w:val="19"/>
+          <w:szCs w:val="19"/>
+          <w:lang w:eastAsia="en-US"/>
+        </w:rPr>
+        <w:t>(or a custom exception)</w:t>
+      </w:r>
+    </w:p>
+    <w:p>
+      <w:pPr>
+        <w:suppressAutoHyphens w:val="0"/>
+        <w:autoSpaceDE w:val="0"/>
+        <w:autoSpaceDN w:val="0"/>
+        <w:adjustRightInd w:val="0"/>
+        <w:ind w:left="720"/>
+        <w:rPr>
+          <w:rFonts w:ascii="Consolas" w:hAnsi="Consolas" w:cs="Consolas"/>
+          <w:color w:val="3A7C22" w:themeColor="accent6" w:themeShade="BF"/>
+          <w:sz w:val="19"/>
+          <w:szCs w:val="19"/>
+          <w:lang w:eastAsia="en-US"/>
+        </w:rPr>
+      </w:pPr>
       <w:r>
         <w:rPr>
           <w:rFonts w:ascii="Consolas" w:hAnsi="Consolas" w:cs="Consolas"/>
@@ -1868,34 +1827,8 @@
           <w:szCs w:val="19"/>
           <w:lang w:eastAsia="en-US"/>
         </w:rPr>
-        <w:t xml:space="preserve"> </w:t>
-      </w:r>
-      <w:r>
-        <w:rPr>
-          <w:rFonts w:ascii="Consolas" w:hAnsi="Consolas" w:cs="Consolas"/>
-          <w:color w:val="3A7C22" w:themeColor="accent6" w:themeShade="BF"/>
-          <w:sz w:val="19"/>
-          <w:szCs w:val="19"/>
-          <w:lang w:eastAsia="en-US"/>
-        </w:rPr>
-        <w:t>(or a custom exception)</w:t>
-      </w:r>
-    </w:p>
-    <w:p>
-      <w:pPr>
-        <w:suppressAutoHyphens w:val="0"/>
-        <w:autoSpaceDE w:val="0"/>
-        <w:autoSpaceDN w:val="0"/>
-        <w:adjustRightInd w:val="0"/>
-        <w:ind w:left="720"/>
-        <w:rPr>
-          <w:rFonts w:ascii="Consolas" w:hAnsi="Consolas" w:cs="Consolas"/>
-          <w:color w:val="3A7C22" w:themeColor="accent6" w:themeShade="BF"/>
-          <w:sz w:val="19"/>
-          <w:szCs w:val="19"/>
-          <w:lang w:eastAsia="en-US"/>
-        </w:rPr>
-      </w:pPr>
+        <w:t xml:space="preserve">//  </w:t>
+      </w:r>
       <w:r>
         <w:rPr>
           <w:rFonts w:ascii="Consolas" w:hAnsi="Consolas" w:cs="Consolas"/>
@@ -1904,6 +1837,62 @@
           <w:szCs w:val="19"/>
           <w:lang w:eastAsia="en-US"/>
         </w:rPr>
+        <w:tab/>
+      </w:r>
+      <w:r>
+        <w:rPr>
+          <w:rFonts w:ascii="Consolas" w:hAnsi="Consolas" w:cs="Consolas"/>
+          <w:color w:val="3A7C22" w:themeColor="accent6" w:themeShade="BF"/>
+          <w:sz w:val="19"/>
+          <w:szCs w:val="19"/>
+          <w:lang w:eastAsia="en-US"/>
+        </w:rPr>
+        <w:t xml:space="preserve">if username </w:t>
+      </w:r>
+      <w:r>
+        <w:rPr>
+          <w:rFonts w:ascii="Consolas" w:hAnsi="Consolas" w:cs="Consolas"/>
+          <w:color w:val="3A7C22" w:themeColor="accent6" w:themeShade="BF"/>
+          <w:sz w:val="19"/>
+          <w:szCs w:val="19"/>
+          <w:lang w:eastAsia="en-US"/>
+        </w:rPr>
+        <w:t xml:space="preserve">is </w:t>
+      </w:r>
+      <w:r>
+        <w:rPr>
+          <w:rFonts w:ascii="Consolas" w:hAnsi="Consolas" w:cs="Consolas"/>
+          <w:color w:val="00B0F0"/>
+          <w:sz w:val="19"/>
+          <w:szCs w:val="19"/>
+          <w:lang w:eastAsia="en-US"/>
+        </w:rPr>
+        <w:t>null</w:t>
+      </w:r>
+    </w:p>
+    <w:p>
+      <w:pPr>
+        <w:suppressAutoHyphens w:val="0"/>
+        <w:autoSpaceDE w:val="0"/>
+        <w:autoSpaceDN w:val="0"/>
+        <w:adjustRightInd w:val="0"/>
+        <w:ind w:firstLine="720"/>
+        <w:rPr>
+          <w:rFonts w:ascii="Consolas" w:hAnsi="Consolas" w:cs="Consolas"/>
+          <w:color w:val="3A7C22" w:themeColor="accent6" w:themeShade="BF"/>
+          <w:sz w:val="19"/>
+          <w:szCs w:val="19"/>
+          <w:lang w:eastAsia="en-US"/>
+        </w:rPr>
+      </w:pPr>
+      <w:r>
+        <w:rPr>
+          <w:rFonts w:ascii="Consolas" w:hAnsi="Consolas" w:cs="Consolas"/>
+          <w:color w:val="77206D" w:themeColor="accent5" w:themeShade="BF"/>
+          <w:sz w:val="19"/>
+          <w:szCs w:val="19"/>
+          <w:lang w:eastAsia="en-US"/>
+        </w:rPr>
         <w:t xml:space="preserve">//  </w:t>
       </w:r>
       <w:r>
@@ -1944,7 +1933,17 @@
           <w:szCs w:val="19"/>
           <w:lang w:eastAsia="en-US"/>
         </w:rPr>
-        <w:t>null</w:t>
+        <w:t xml:space="preserve">empty </w:t>
+      </w:r>
+      <w:r>
+        <w:rPr>
+          <w:rFonts w:ascii="Consolas" w:hAnsi="Consolas" w:cs="Consolas"/>
+          <w:color w:val="3A7C22" w:themeColor="accent6" w:themeShade="BF"/>
+          <w:sz w:val="19"/>
+          <w:szCs w:val="19"/>
+          <w:lang w:eastAsia="en-US"/>
+        </w:rPr>
+        <w:t>(spaces/tabs)</w:t>
       </w:r>
     </w:p>
     <w:p>
@@ -1965,7 +1964,7 @@
       <w:r>
         <w:rPr>
           <w:rFonts w:ascii="Consolas" w:hAnsi="Consolas" w:cs="Consolas"/>
-          <w:color w:val="77206D" w:themeColor="accent5" w:themeShade="BF"/>
+          <w:color w:val="3A7C22" w:themeColor="accent6" w:themeShade="BF"/>
           <w:sz w:val="19"/>
           <w:szCs w:val="19"/>
           <w:lang w:eastAsia="en-US"/>
@@ -1975,120 +1974,12 @@
       <w:r>
         <w:rPr>
           <w:rFonts w:ascii="Consolas" w:hAnsi="Consolas" w:cs="Consolas"/>
-          <w:color w:val="77206D" w:themeColor="accent5" w:themeShade="BF"/>
+          <w:color w:val="3A7C22" w:themeColor="accent6" w:themeShade="BF"/>
           <w:sz w:val="19"/>
           <w:szCs w:val="19"/>
           <w:lang w:eastAsia="en-US"/>
         </w:rPr>
         <w:tab/>
-      </w:r>
-      <w:r>
-        <w:rPr>
-          <w:rFonts w:ascii="Consolas" w:hAnsi="Consolas" w:cs="Consolas"/>
-          <w:color w:val="3A7C22" w:themeColor="accent6" w:themeShade="BF"/>
-          <w:sz w:val="19"/>
-          <w:szCs w:val="19"/>
-          <w:lang w:eastAsia="en-US"/>
-        </w:rPr>
-        <w:t xml:space="preserve">if username </w:t>
-      </w:r>
-      <w:r>
-        <w:rPr>
-          <w:rFonts w:ascii="Consolas" w:hAnsi="Consolas" w:cs="Consolas"/>
-          <w:color w:val="3A7C22" w:themeColor="accent6" w:themeShade="BF"/>
-          <w:sz w:val="19"/>
-          <w:szCs w:val="19"/>
-          <w:lang w:eastAsia="en-US"/>
-        </w:rPr>
-        <w:t xml:space="preserve">is </w:t>
-      </w:r>
-      <w:r>
-        <w:rPr>
-          <w:rFonts w:ascii="Consolas" w:hAnsi="Consolas" w:cs="Consolas"/>
-          <w:color w:val="00B0F0"/>
-          <w:sz w:val="19"/>
-          <w:szCs w:val="19"/>
-          <w:lang w:eastAsia="en-US"/>
-        </w:rPr>
-        <w:t xml:space="preserve">empty </w:t>
-      </w:r>
-      <w:r>
-        <w:rPr>
-          <w:rFonts w:ascii="Consolas" w:hAnsi="Consolas" w:cs="Consolas"/>
-          <w:color w:val="3A7C22" w:themeColor="accent6" w:themeShade="BF"/>
-          <w:sz w:val="19"/>
-          <w:szCs w:val="19"/>
-          <w:lang w:eastAsia="en-US"/>
-        </w:rPr>
-        <w:t>(spaces/tabs)</w:t>
-      </w:r>
-    </w:p>
-    <w:p>
-      <w:pPr>
-        <w:suppressAutoHyphens w:val="0"/>
-        <w:autoSpaceDE w:val="0"/>
-        <w:autoSpaceDN w:val="0"/>
-        <w:adjustRightInd w:val="0"/>
-        <w:ind w:firstLine="720"/>
-        <w:rPr>
-          <w:rFonts w:ascii="Consolas" w:hAnsi="Consolas" w:cs="Consolas"/>
-          <w:color w:val="3A7C22" w:themeColor="accent6" w:themeShade="BF"/>
-          <w:sz w:val="19"/>
-          <w:szCs w:val="19"/>
-          <w:lang w:eastAsia="en-US"/>
-        </w:rPr>
-      </w:pPr>
-      <w:r>
-        <w:rPr>
-          <w:rFonts w:ascii="Consolas" w:hAnsi="Consolas" w:cs="Consolas"/>
-          <w:color w:val="3A7C22" w:themeColor="accent6" w:themeShade="BF"/>
-          <w:sz w:val="19"/>
-          <w:szCs w:val="19"/>
-          <w:lang w:eastAsia="en-US"/>
-        </w:rPr>
-        <w:t xml:space="preserve">//  </w:t>
-      </w:r>
-      <w:r>
-        <w:rPr>
-          <w:rFonts w:ascii="Consolas" w:hAnsi="Consolas" w:cs="Consolas"/>
-          <w:color w:val="3A7C22" w:themeColor="accent6" w:themeShade="BF"/>
-          <w:sz w:val="19"/>
-          <w:szCs w:val="19"/>
-          <w:lang w:eastAsia="en-US"/>
-        </w:rPr>
-        <w:tab/>
-        <w:t xml:space="preserve">throw </w:t>
-      </w:r>
-      <w:proofErr w:type="spellStart"/>
-      <w:r>
-        <w:rPr>
-          <w:rFonts w:ascii="Consolas" w:hAnsi="Consolas" w:cs="Consolas"/>
-          <w:color w:val="77206D" w:themeColor="accent5" w:themeShade="BF"/>
-          <w:sz w:val="19"/>
-          <w:szCs w:val="19"/>
-          <w:lang w:eastAsia="en-US"/>
-        </w:rPr>
-        <w:t>ArgumentException</w:t>
-      </w:r>
-      <w:proofErr w:type="spellEnd"/>
-      <w:r>
-        <w:rPr>
-          <w:rFonts w:ascii="Consolas" w:hAnsi="Consolas" w:cs="Consolas"/>
-          <w:color w:val="77206D" w:themeColor="accent5" w:themeShade="BF"/>
-          <w:sz w:val="19"/>
-          <w:szCs w:val="19"/>
-          <w:lang w:eastAsia="en-US"/>
-        </w:rPr>
-        <w:t xml:space="preserve"> </w:t>
-      </w:r>
-      <w:r>
-        <w:rPr>
-          <w:rFonts w:ascii="Consolas" w:hAnsi="Consolas" w:cs="Consolas"/>
-          <w:color w:val="3A7C22" w:themeColor="accent6" w:themeShade="BF"/>
-          <w:sz w:val="19"/>
-          <w:szCs w:val="19"/>
-          <w:lang w:eastAsia="en-US"/>
-        </w:rPr>
         <w:t>if user is not registered</w:t>
       </w:r>
     </w:p>
@@ -2277,7 +2168,6 @@
         </w:rPr>
         <w:t xml:space="preserve"> bool </w:t>
       </w:r>
-      <w:proofErr w:type="spellStart"/>
       <w:r>
         <w:rPr>
           <w:rFonts w:ascii="Consolas" w:hAnsi="Consolas" w:cs="Consolas"/>
@@ -2300,20 +2190,7 @@
           <w:szCs w:val="19"/>
           <w:lang w:eastAsia="en-US"/>
         </w:rPr>
-        <w:t>asAccess</w:t>
-      </w:r>
-      <w:proofErr w:type="spellEnd"/>
-      <w:r>
-        <w:rPr>
-          <w:rFonts w:ascii="Consolas" w:hAnsi="Consolas" w:cs="Consolas"/>
-          <w:b/>
-          <w:bCs/>
-          <w:color w:val="000000"/>
-          <w:sz w:val="19"/>
-          <w:szCs w:val="19"/>
-          <w:lang w:eastAsia="en-US"/>
-        </w:rPr>
-        <w:t>(</w:t>
+        <w:t>asAccess(</w:t>
       </w:r>
       <w:r>
         <w:rPr>
@@ -2361,33 +2238,7 @@
           <w:szCs w:val="19"/>
           <w:lang w:eastAsia="en-US"/>
         </w:rPr>
-        <w:t xml:space="preserve">tring </w:t>
-      </w:r>
-      <w:proofErr w:type="spellStart"/>
-      <w:r>
-        <w:rPr>
-          <w:rFonts w:ascii="Consolas" w:hAnsi="Consolas" w:cs="Consolas"/>
-          <w:b/>
-          <w:bCs/>
-          <w:color w:val="000000"/>
-          <w:sz w:val="19"/>
-          <w:szCs w:val="19"/>
-          <w:lang w:eastAsia="en-US"/>
-        </w:rPr>
-        <w:t>requiredRole</w:t>
-      </w:r>
-      <w:proofErr w:type="spellEnd"/>
-      <w:r>
-        <w:rPr>
-          <w:rFonts w:ascii="Consolas" w:hAnsi="Consolas" w:cs="Consolas"/>
-          <w:b/>
-          <w:bCs/>
-          <w:color w:val="000000"/>
-          <w:sz w:val="19"/>
-          <w:szCs w:val="19"/>
-          <w:lang w:eastAsia="en-US"/>
-        </w:rPr>
-        <w:t>)</w:t>
+        <w:t>tring requiredRole)</w:t>
       </w:r>
     </w:p>
     <w:p>
@@ -2449,7 +2300,6 @@
         </w:rPr>
         <w:t xml:space="preserve">// throw </w:t>
       </w:r>
-      <w:proofErr w:type="spellStart"/>
       <w:r>
         <w:rPr>
           <w:rFonts w:ascii="Consolas" w:hAnsi="Consolas" w:cs="Consolas"/>
@@ -2458,18 +2308,7 @@
           <w:szCs w:val="19"/>
           <w:lang w:eastAsia="en-US"/>
         </w:rPr>
-        <w:t>ArgumentException</w:t>
-      </w:r>
-      <w:proofErr w:type="spellEnd"/>
-      <w:r>
-        <w:rPr>
-          <w:rFonts w:ascii="Consolas" w:hAnsi="Consolas" w:cs="Consolas"/>
-          <w:color w:val="77206D" w:themeColor="accent5" w:themeShade="BF"/>
-          <w:sz w:val="19"/>
-          <w:szCs w:val="19"/>
-          <w:lang w:eastAsia="en-US"/>
-        </w:rPr>
-        <w:t xml:space="preserve"> </w:t>
+        <w:t xml:space="preserve">ArgumentException </w:t>
       </w:r>
       <w:r>
         <w:rPr>
@@ -2507,20 +2346,8 @@
           <w:szCs w:val="19"/>
           <w:lang w:eastAsia="en-US"/>
         </w:rPr>
-        <w:t xml:space="preserve"> // return true if the user’s role matches the </w:t>
-      </w:r>
-      <w:proofErr w:type="spellStart"/>
-      <w:r>
-        <w:rPr>
-          <w:rFonts w:ascii="Consolas" w:hAnsi="Consolas" w:cs="Consolas"/>
-          <w:color w:val="3A7C22" w:themeColor="accent6" w:themeShade="BF"/>
-          <w:sz w:val="19"/>
-          <w:szCs w:val="19"/>
-          <w:lang w:eastAsia="en-US"/>
-        </w:rPr>
-        <w:t>requiredRole</w:t>
-      </w:r>
-      <w:proofErr w:type="spellEnd"/>
+        <w:t xml:space="preserve"> // return true if the user’s role matches the requiredRole</w:t>
+      </w:r>
     </w:p>
     <w:p>
       <w:pPr>

</xml_diff>